<commit_message>
Containers running - kong not working
</commit_message>
<xml_diff>
--- a/Assignment/CO3404 Assessment Brief 2024_25.docx
+++ b/Assignment/CO3404 Assessment Brief 2024_25.docx
@@ -19781,477 +19781,473 @@
       <w:r>
         <w:t xml:space="preserve">by implementing </w:t>
       </w:r>
+      <w:proofErr w:type="gramStart"/>
+      <w:r>
+        <w:t>a</w:t>
+      </w:r>
+      <w:proofErr w:type="gramEnd"/>
+      <w:r>
+        <w:t xml:space="preserve"> </w:t>
+      </w:r>
+      <w:r>
+        <w:t>Event-Carried State Transfer (</w:t>
+      </w:r>
+      <w:r>
+        <w:t xml:space="preserve">ECST) pattern discussed in the notes and illustrated in a </w:t>
+      </w:r>
+      <w:r>
+        <w:t xml:space="preserve">provided </w:t>
+      </w:r>
+      <w:r>
+        <w:t>code demo</w:t>
+      </w:r>
+      <w:r>
+        <w:t xml:space="preserve"> called “</w:t>
+      </w:r>
       <w:proofErr w:type="spellStart"/>
+      <w:r>
+        <w:t>rabbitPubSub</w:t>
+      </w:r>
+      <w:proofErr w:type="spellEnd"/>
+      <w:r>
+        <w:t>” on Blackboard</w:t>
+      </w:r>
+      <w:r>
+        <w:t xml:space="preserve">. </w:t>
+      </w:r>
+      <w:r>
+        <w:t>It also</w:t>
+      </w:r>
+      <w:r>
+        <w:t xml:space="preserve"> introduces another microservice</w:t>
+      </w:r>
+      <w:r>
+        <w:t xml:space="preserve"> called moderate</w:t>
+      </w:r>
+      <w:r>
+        <w:t xml:space="preserve">. </w:t>
+      </w:r>
+    </w:p>
+    <w:p/>
+    <w:p>
+      <w:pPr>
+        <w:rPr>
+          <w:rFonts w:asciiTheme="minorHAnsi" w:hAnsiTheme="minorHAnsi" w:cstheme="minorHAnsi"/>
+        </w:rPr>
+      </w:pPr>
+      <w:r>
+        <w:rPr>
+          <w:rFonts w:asciiTheme="minorHAnsi" w:hAnsiTheme="minorHAnsi" w:cstheme="minorHAnsi"/>
+        </w:rPr>
+        <w:t xml:space="preserve">The moderate microservice </w:t>
+      </w:r>
+      <w:r>
+        <w:rPr>
+          <w:rFonts w:asciiTheme="minorHAnsi" w:hAnsiTheme="minorHAnsi" w:cstheme="minorHAnsi"/>
+        </w:rPr>
+        <w:t>enables a</w:t>
+      </w:r>
+      <w:r>
+        <w:rPr>
+          <w:rFonts w:asciiTheme="minorHAnsi" w:hAnsiTheme="minorHAnsi" w:cstheme="minorHAnsi"/>
+        </w:rPr>
+        <w:t>n authenticated</w:t>
+      </w:r>
+      <w:r>
+        <w:rPr>
+          <w:rFonts w:asciiTheme="minorHAnsi" w:hAnsiTheme="minorHAnsi" w:cstheme="minorHAnsi"/>
+        </w:rPr>
+        <w:t xml:space="preserve"> human moderator to review the newly submitted joke and type</w:t>
+      </w:r>
+      <w:r>
+        <w:rPr>
+          <w:rFonts w:asciiTheme="minorHAnsi" w:hAnsiTheme="minorHAnsi" w:cstheme="minorHAnsi"/>
+        </w:rPr>
+        <w:t xml:space="preserve"> by reading the submitted joke and type</w:t>
+      </w:r>
+      <w:r>
+        <w:rPr>
+          <w:rFonts w:asciiTheme="minorHAnsi" w:hAnsiTheme="minorHAnsi" w:cstheme="minorHAnsi"/>
+        </w:rPr>
+        <w:t>, if available,</w:t>
+      </w:r>
+      <w:r>
+        <w:rPr>
+          <w:rFonts w:asciiTheme="minorHAnsi" w:hAnsiTheme="minorHAnsi" w:cstheme="minorHAnsi"/>
+        </w:rPr>
+        <w:t xml:space="preserve"> from the </w:t>
+      </w:r>
+      <w:r>
+        <w:rPr>
+          <w:rFonts w:asciiTheme="minorHAnsi" w:hAnsiTheme="minorHAnsi" w:cstheme="minorHAnsi"/>
+        </w:rPr>
+        <w:t xml:space="preserve">submit microservice via the queue and presenting it to the moderator in a UI which enables the moderator </w:t>
+      </w:r>
+      <w:r>
+        <w:rPr>
+          <w:rFonts w:asciiTheme="minorHAnsi" w:hAnsiTheme="minorHAnsi" w:cstheme="minorHAnsi"/>
+        </w:rPr>
+        <w:t xml:space="preserve">to review and if required, edit any of the components – setup, punchline and type.  </w:t>
+      </w:r>
+      <w:r>
+        <w:rPr>
+          <w:rFonts w:asciiTheme="minorHAnsi" w:hAnsiTheme="minorHAnsi" w:cstheme="minorHAnsi"/>
+        </w:rPr>
+        <w:t xml:space="preserve">If there are </w:t>
+      </w:r>
+      <w:r>
+        <w:rPr>
+          <w:rFonts w:asciiTheme="minorHAnsi" w:hAnsiTheme="minorHAnsi" w:cstheme="minorHAnsi"/>
+        </w:rPr>
+        <w:t>no new jokes</w:t>
+      </w:r>
+      <w:r>
+        <w:rPr>
+          <w:rFonts w:asciiTheme="minorHAnsi" w:hAnsiTheme="minorHAnsi" w:cstheme="minorHAnsi"/>
+        </w:rPr>
+        <w:t xml:space="preserve"> available</w:t>
+      </w:r>
+      <w:r>
+        <w:rPr>
+          <w:rFonts w:asciiTheme="minorHAnsi" w:hAnsiTheme="minorHAnsi" w:cstheme="minorHAnsi"/>
+        </w:rPr>
+        <w:t xml:space="preserve"> to moderate</w:t>
+      </w:r>
+      <w:r>
+        <w:rPr>
+          <w:rFonts w:asciiTheme="minorHAnsi" w:hAnsiTheme="minorHAnsi" w:cstheme="minorHAnsi"/>
+        </w:rPr>
+        <w:t>, an appropriate message should be displayed</w:t>
+      </w:r>
+      <w:r>
+        <w:rPr>
+          <w:rFonts w:asciiTheme="minorHAnsi" w:hAnsiTheme="minorHAnsi" w:cstheme="minorHAnsi"/>
+        </w:rPr>
+        <w:t>,</w:t>
+      </w:r>
+      <w:r>
+        <w:rPr>
+          <w:rFonts w:asciiTheme="minorHAnsi" w:hAnsiTheme="minorHAnsi" w:cstheme="minorHAnsi"/>
+        </w:rPr>
+        <w:t xml:space="preserve"> and the UI should poll for a new </w:t>
+      </w:r>
+      <w:r>
+        <w:rPr>
+          <w:rFonts w:asciiTheme="minorHAnsi" w:hAnsiTheme="minorHAnsi" w:cstheme="minorHAnsi"/>
+        </w:rPr>
+        <w:t>joke</w:t>
+      </w:r>
+      <w:r>
+        <w:rPr>
+          <w:rFonts w:asciiTheme="minorHAnsi" w:hAnsiTheme="minorHAnsi" w:cstheme="minorHAnsi"/>
+        </w:rPr>
+        <w:t xml:space="preserve"> – e.g. every second</w:t>
+      </w:r>
+      <w:r>
+        <w:rPr>
+          <w:rFonts w:asciiTheme="minorHAnsi" w:hAnsiTheme="minorHAnsi" w:cstheme="minorHAnsi"/>
+        </w:rPr>
+        <w:t>. On submission</w:t>
+      </w:r>
+      <w:r>
+        <w:rPr>
+          <w:rFonts w:asciiTheme="minorHAnsi" w:hAnsiTheme="minorHAnsi" w:cstheme="minorHAnsi"/>
+        </w:rPr>
+        <w:t xml:space="preserve"> by the moderator</w:t>
+      </w:r>
+      <w:r>
+        <w:rPr>
+          <w:rFonts w:asciiTheme="minorHAnsi" w:hAnsiTheme="minorHAnsi" w:cstheme="minorHAnsi"/>
+        </w:rPr>
+        <w:t xml:space="preserve"> or deletion</w:t>
+      </w:r>
+      <w:r>
+        <w:rPr>
+          <w:rFonts w:asciiTheme="minorHAnsi" w:hAnsiTheme="minorHAnsi" w:cstheme="minorHAnsi"/>
+        </w:rPr>
+        <w:t xml:space="preserve"> </w:t>
+      </w:r>
+      <w:r>
+        <w:rPr>
+          <w:rFonts w:asciiTheme="minorHAnsi" w:hAnsiTheme="minorHAnsi" w:cstheme="minorHAnsi"/>
+        </w:rPr>
+        <w:t xml:space="preserve">by the moderator </w:t>
+      </w:r>
+      <w:r>
+        <w:rPr>
+          <w:rFonts w:asciiTheme="minorHAnsi" w:hAnsiTheme="minorHAnsi" w:cstheme="minorHAnsi"/>
+        </w:rPr>
+        <w:t>if the joke is wholly inappropriate</w:t>
+      </w:r>
+      <w:r>
+        <w:rPr>
+          <w:rFonts w:asciiTheme="minorHAnsi" w:hAnsiTheme="minorHAnsi" w:cstheme="minorHAnsi"/>
+        </w:rPr>
+        <w:t>, the next one</w:t>
+      </w:r>
+      <w:r>
+        <w:rPr>
+          <w:rFonts w:asciiTheme="minorHAnsi" w:hAnsiTheme="minorHAnsi" w:cstheme="minorHAnsi"/>
+        </w:rPr>
+        <w:t xml:space="preserve"> in the queue</w:t>
+      </w:r>
+      <w:r>
+        <w:rPr>
+          <w:rFonts w:asciiTheme="minorHAnsi" w:hAnsiTheme="minorHAnsi" w:cstheme="minorHAnsi"/>
+        </w:rPr>
+        <w:t>, if available, should be loaded into the UI.</w:t>
+      </w:r>
+      <w:r>
+        <w:rPr>
+          <w:rFonts w:asciiTheme="minorHAnsi" w:hAnsiTheme="minorHAnsi" w:cstheme="minorHAnsi"/>
+        </w:rPr>
+        <w:t xml:space="preserve"> </w:t>
+      </w:r>
+      <w:r>
+        <w:rPr>
+          <w:rFonts w:asciiTheme="minorHAnsi" w:hAnsiTheme="minorHAnsi" w:cstheme="minorHAnsi"/>
+        </w:rPr>
+        <w:t xml:space="preserve">Note: deletion in this case is simply a non-submission and a call </w:t>
+      </w:r>
+      <w:r>
+        <w:rPr>
+          <w:rFonts w:asciiTheme="minorHAnsi" w:hAnsiTheme="minorHAnsi" w:cstheme="minorHAnsi"/>
+        </w:rPr>
+        <w:t xml:space="preserve">is made </w:t>
+      </w:r>
+      <w:r>
+        <w:rPr>
+          <w:rFonts w:asciiTheme="minorHAnsi" w:hAnsiTheme="minorHAnsi" w:cstheme="minorHAnsi"/>
+        </w:rPr>
+        <w:t xml:space="preserve">for the next joke. </w:t>
+      </w:r>
+      <w:r>
+        <w:rPr>
+          <w:rFonts w:asciiTheme="minorHAnsi" w:hAnsiTheme="minorHAnsi" w:cstheme="minorHAnsi"/>
+        </w:rPr>
+        <w:t>Typically,</w:t>
+      </w:r>
+      <w:r>
+        <w:rPr>
+          <w:rFonts w:asciiTheme="minorHAnsi" w:hAnsiTheme="minorHAnsi" w:cstheme="minorHAnsi"/>
+        </w:rPr>
+        <w:t xml:space="preserve"> however, we would generate a deleted event which could be subscribed to by an analytics microservice for example</w:t>
+      </w:r>
+      <w:r>
+        <w:rPr>
+          <w:rFonts w:asciiTheme="minorHAnsi" w:hAnsiTheme="minorHAnsi" w:cstheme="minorHAnsi"/>
+        </w:rPr>
+        <w:t>, but that’s not necessary in this case</w:t>
+      </w:r>
+      <w:r>
+        <w:rPr>
+          <w:rFonts w:asciiTheme="minorHAnsi" w:hAnsiTheme="minorHAnsi" w:cstheme="minorHAnsi"/>
+        </w:rPr>
+        <w:t xml:space="preserve">. </w:t>
+      </w:r>
+    </w:p>
+    <w:p/>
+    <w:p>
+      <w:r>
+        <w:t xml:space="preserve">This </w:t>
+      </w:r>
+      <w:r>
+        <w:t xml:space="preserve">modified architecture </w:t>
+      </w:r>
+      <w:r>
+        <w:t>requires the broker to be available to all microservices</w:t>
+      </w:r>
+      <w:r>
+        <w:t xml:space="preserve"> and be configured to </w:t>
+      </w:r>
+      <w:r>
+        <w:t xml:space="preserve">manage events. </w:t>
+      </w:r>
+      <w:r>
+        <w:t>The broker works in the same way as before</w:t>
+      </w:r>
+      <w:r>
+        <w:t>,</w:t>
+      </w:r>
+      <w:r>
+        <w:t xml:space="preserve"> but the messaging is a little different. </w:t>
+      </w:r>
+    </w:p>
+    <w:p/>
+    <w:p>
+      <w:r>
+        <w:t xml:space="preserve">The </w:t>
+      </w:r>
+      <w:r>
+        <w:t xml:space="preserve">submit </w:t>
+      </w:r>
+      <w:r>
+        <w:t xml:space="preserve">microservice </w:t>
+      </w:r>
+      <w:r>
+        <w:t xml:space="preserve">(producer) </w:t>
+      </w:r>
+      <w:r>
+        <w:t xml:space="preserve">puts the submitted new joke onto a queue </w:t>
+      </w:r>
+      <w:r>
+        <w:t>(submit</w:t>
+      </w:r>
+      <w:r>
+        <w:t xml:space="preserve">) </w:t>
+      </w:r>
+      <w:r>
+        <w:t xml:space="preserve">which is received by the </w:t>
+      </w:r>
+      <w:r>
+        <w:t>moderate service</w:t>
+      </w:r>
+      <w:r>
+        <w:t xml:space="preserve"> (consumer)</w:t>
+      </w:r>
+      <w:r>
+        <w:t xml:space="preserve">. </w:t>
+      </w:r>
+      <w:r>
+        <w:t xml:space="preserve">When the moderator has reviewed the joke and potentially edited it, </w:t>
+      </w:r>
+      <w:r>
+        <w:t xml:space="preserve">it is sent </w:t>
+      </w:r>
+      <w:r>
+        <w:t xml:space="preserve">by the moderate microservice </w:t>
+      </w:r>
+      <w:r>
+        <w:t xml:space="preserve">as a producer </w:t>
+      </w:r>
+      <w:r>
+        <w:t xml:space="preserve">to a queue </w:t>
+      </w:r>
+      <w:r>
+        <w:t>(</w:t>
+      </w:r>
+      <w:r>
+        <w:t>moderated</w:t>
+      </w:r>
+      <w:r>
+        <w:t xml:space="preserve">) </w:t>
+      </w:r>
+      <w:r>
+        <w:t xml:space="preserve">and </w:t>
+      </w:r>
+      <w:r>
+        <w:t xml:space="preserve">received by the joke microservice </w:t>
+      </w:r>
+      <w:r>
+        <w:t>ETL</w:t>
+      </w:r>
+      <w:r>
+        <w:t xml:space="preserve"> application (consumer) </w:t>
+      </w:r>
+      <w:r>
+        <w:t>to be written into the database as shown in the architectural diagram</w:t>
+      </w:r>
+      <w:r>
+        <w:t xml:space="preserve">. </w:t>
+      </w:r>
+      <w:r>
+        <w:t xml:space="preserve">This is only slightly different to the previous option with the addition of an </w:t>
+      </w:r>
+      <w:proofErr w:type="spellStart"/>
+      <w:r>
+        <w:t>additionalqueue</w:t>
+      </w:r>
+      <w:proofErr w:type="spellEnd"/>
+      <w:r>
+        <w:t>.</w:t>
+      </w:r>
+      <w:r>
+        <w:t xml:space="preserve"> </w:t>
+      </w:r>
+    </w:p>
+    <w:p/>
+    <w:p>
+      <w:r>
+        <w:t>Rather than continually call the joke type API to try to keep the types</w:t>
+      </w:r>
+      <w:r>
+        <w:t>’</w:t>
+      </w:r>
+      <w:r>
+        <w:t xml:space="preserve"> cache in sync with the master data </w:t>
+      </w:r>
+      <w:r>
+        <w:t>store (</w:t>
+      </w:r>
+      <w:proofErr w:type="spellStart"/>
+      <w:r>
+        <w:t>SoR</w:t>
+      </w:r>
+      <w:proofErr w:type="spellEnd"/>
+      <w:r>
+        <w:t xml:space="preserve">), the </w:t>
+      </w:r>
+      <w:r>
+        <w:t>ETL</w:t>
+      </w:r>
+      <w:r>
+        <w:t xml:space="preserve"> application will </w:t>
+      </w:r>
+      <w:r>
+        <w:t>writ</w:t>
+      </w:r>
+      <w:r>
+        <w:t>e</w:t>
+      </w:r>
+      <w:r>
+        <w:t xml:space="preserve"> the type to the types</w:t>
+      </w:r>
+      <w:r>
+        <w:t>’</w:t>
+      </w:r>
+      <w:r>
+        <w:t xml:space="preserve"> database table </w:t>
+      </w:r>
+      <w:r>
+        <w:t>if it is not already present</w:t>
+      </w:r>
+      <w:r>
+        <w:t xml:space="preserve"> and i</w:t>
+      </w:r>
+      <w:r>
+        <w:t xml:space="preserve">f a write is successful, </w:t>
+      </w:r>
+      <w:r>
+        <w:t>ETL</w:t>
+      </w:r>
+      <w:r>
+        <w:t xml:space="preserve"> will create a </w:t>
+      </w:r>
+      <w:proofErr w:type="spellStart"/>
+      <w:r>
+        <w:t>type_update</w:t>
+      </w:r>
+      <w:proofErr w:type="spellEnd"/>
+      <w:r>
+        <w:t xml:space="preserve"> event and send it to the broker. All subscribers (moderate and submit) will receive the event and update their </w:t>
+      </w:r>
       <w:proofErr w:type="gramStart"/>
       <w:r>
-        <w:t>a</w:t>
-      </w:r>
-      <w:proofErr w:type="spellEnd"/>
+        <w:t>types</w:t>
+      </w:r>
+      <w:r>
+        <w:t>’</w:t>
+      </w:r>
       <w:proofErr w:type="gramEnd"/>
       <w:r>
-        <w:t xml:space="preserve"> </w:t>
-      </w:r>
-      <w:r>
-        <w:t>Event-Carried State Transfer (</w:t>
-      </w:r>
-      <w:r>
-        <w:t xml:space="preserve">ECST) pattern discussed in the notes and illustrated in a </w:t>
-      </w:r>
-      <w:r>
-        <w:t xml:space="preserve">provided </w:t>
-      </w:r>
-      <w:r>
-        <w:t>code demo</w:t>
-      </w:r>
-      <w:r>
-        <w:t xml:space="preserve"> called “</w:t>
-      </w:r>
-      <w:proofErr w:type="spellStart"/>
-      <w:r>
-        <w:t>rabbitPubSub</w:t>
-      </w:r>
-      <w:proofErr w:type="spellEnd"/>
-      <w:r>
-        <w:t>” on Blackboard</w:t>
-      </w:r>
-      <w:r>
-        <w:t xml:space="preserve">. </w:t>
-      </w:r>
-      <w:r>
-        <w:t>It also</w:t>
-      </w:r>
-      <w:r>
-        <w:t xml:space="preserve"> introduces another microservice</w:t>
-      </w:r>
-      <w:r>
-        <w:t xml:space="preserve"> called moderate</w:t>
-      </w:r>
-      <w:r>
-        <w:t xml:space="preserve">. </w:t>
-      </w:r>
-    </w:p>
-    <w:p/>
-    <w:p>
-      <w:pPr>
-        <w:rPr>
-          <w:rFonts w:asciiTheme="minorHAnsi" w:hAnsiTheme="minorHAnsi" w:cstheme="minorHAnsi"/>
-        </w:rPr>
-      </w:pPr>
-      <w:r>
-        <w:rPr>
-          <w:rFonts w:asciiTheme="minorHAnsi" w:hAnsiTheme="minorHAnsi" w:cstheme="minorHAnsi"/>
-        </w:rPr>
-        <w:t xml:space="preserve">The moderate microservice </w:t>
-      </w:r>
-      <w:r>
-        <w:rPr>
-          <w:rFonts w:asciiTheme="minorHAnsi" w:hAnsiTheme="minorHAnsi" w:cstheme="minorHAnsi"/>
-        </w:rPr>
-        <w:t>enables a</w:t>
-      </w:r>
-      <w:r>
-        <w:rPr>
-          <w:rFonts w:asciiTheme="minorHAnsi" w:hAnsiTheme="minorHAnsi" w:cstheme="minorHAnsi"/>
-        </w:rPr>
-        <w:t>n authenticated</w:t>
-      </w:r>
-      <w:r>
-        <w:rPr>
-          <w:rFonts w:asciiTheme="minorHAnsi" w:hAnsiTheme="minorHAnsi" w:cstheme="minorHAnsi"/>
-        </w:rPr>
-        <w:t xml:space="preserve"> human moderator to review the newly submitted joke and type</w:t>
-      </w:r>
-      <w:r>
-        <w:rPr>
-          <w:rFonts w:asciiTheme="minorHAnsi" w:hAnsiTheme="minorHAnsi" w:cstheme="minorHAnsi"/>
-        </w:rPr>
-        <w:t xml:space="preserve"> by reading the submitted joke and type</w:t>
-      </w:r>
-      <w:r>
-        <w:rPr>
-          <w:rFonts w:asciiTheme="minorHAnsi" w:hAnsiTheme="minorHAnsi" w:cstheme="minorHAnsi"/>
-        </w:rPr>
-        <w:t>, if available,</w:t>
-      </w:r>
-      <w:r>
-        <w:rPr>
-          <w:rFonts w:asciiTheme="minorHAnsi" w:hAnsiTheme="minorHAnsi" w:cstheme="minorHAnsi"/>
-        </w:rPr>
-        <w:t xml:space="preserve"> from the </w:t>
-      </w:r>
-      <w:r>
-        <w:rPr>
-          <w:rFonts w:asciiTheme="minorHAnsi" w:hAnsiTheme="minorHAnsi" w:cstheme="minorHAnsi"/>
-        </w:rPr>
-        <w:t xml:space="preserve">submit microservice via the queue and presenting it to the moderator in a UI which enables the moderator </w:t>
-      </w:r>
-      <w:r>
-        <w:rPr>
-          <w:rFonts w:asciiTheme="minorHAnsi" w:hAnsiTheme="minorHAnsi" w:cstheme="minorHAnsi"/>
-        </w:rPr>
-        <w:t xml:space="preserve">to review and if required, edit any of the components – setup, punchline and type.  </w:t>
-      </w:r>
-      <w:r>
-        <w:rPr>
-          <w:rFonts w:asciiTheme="minorHAnsi" w:hAnsiTheme="minorHAnsi" w:cstheme="minorHAnsi"/>
-        </w:rPr>
-        <w:t xml:space="preserve">If there are </w:t>
-      </w:r>
-      <w:r>
-        <w:rPr>
-          <w:rFonts w:asciiTheme="minorHAnsi" w:hAnsiTheme="minorHAnsi" w:cstheme="minorHAnsi"/>
-        </w:rPr>
-        <w:t>no new jokes</w:t>
-      </w:r>
-      <w:r>
-        <w:rPr>
-          <w:rFonts w:asciiTheme="minorHAnsi" w:hAnsiTheme="minorHAnsi" w:cstheme="minorHAnsi"/>
-        </w:rPr>
-        <w:t xml:space="preserve"> available</w:t>
-      </w:r>
-      <w:r>
-        <w:rPr>
-          <w:rFonts w:asciiTheme="minorHAnsi" w:hAnsiTheme="minorHAnsi" w:cstheme="minorHAnsi"/>
-        </w:rPr>
-        <w:t xml:space="preserve"> to moderate</w:t>
-      </w:r>
-      <w:r>
-        <w:rPr>
-          <w:rFonts w:asciiTheme="minorHAnsi" w:hAnsiTheme="minorHAnsi" w:cstheme="minorHAnsi"/>
-        </w:rPr>
-        <w:t>, an appropriate message should be displayed</w:t>
-      </w:r>
-      <w:r>
-        <w:rPr>
-          <w:rFonts w:asciiTheme="minorHAnsi" w:hAnsiTheme="minorHAnsi" w:cstheme="minorHAnsi"/>
-        </w:rPr>
-        <w:t>,</w:t>
-      </w:r>
-      <w:r>
-        <w:rPr>
-          <w:rFonts w:asciiTheme="minorHAnsi" w:hAnsiTheme="minorHAnsi" w:cstheme="minorHAnsi"/>
-        </w:rPr>
-        <w:t xml:space="preserve"> and the UI should poll for a new </w:t>
-      </w:r>
-      <w:r>
-        <w:rPr>
-          <w:rFonts w:asciiTheme="minorHAnsi" w:hAnsiTheme="minorHAnsi" w:cstheme="minorHAnsi"/>
-        </w:rPr>
-        <w:t>joke</w:t>
-      </w:r>
-      <w:r>
-        <w:rPr>
-          <w:rFonts w:asciiTheme="minorHAnsi" w:hAnsiTheme="minorHAnsi" w:cstheme="minorHAnsi"/>
-        </w:rPr>
-        <w:t xml:space="preserve"> – e.g. every second</w:t>
-      </w:r>
-      <w:r>
-        <w:rPr>
-          <w:rFonts w:asciiTheme="minorHAnsi" w:hAnsiTheme="minorHAnsi" w:cstheme="minorHAnsi"/>
-        </w:rPr>
-        <w:t>. On submission</w:t>
-      </w:r>
-      <w:r>
-        <w:rPr>
-          <w:rFonts w:asciiTheme="minorHAnsi" w:hAnsiTheme="minorHAnsi" w:cstheme="minorHAnsi"/>
-        </w:rPr>
-        <w:t xml:space="preserve"> by the moderator</w:t>
-      </w:r>
-      <w:r>
-        <w:rPr>
-          <w:rFonts w:asciiTheme="minorHAnsi" w:hAnsiTheme="minorHAnsi" w:cstheme="minorHAnsi"/>
-        </w:rPr>
-        <w:t xml:space="preserve"> or deletion</w:t>
-      </w:r>
-      <w:r>
-        <w:rPr>
-          <w:rFonts w:asciiTheme="minorHAnsi" w:hAnsiTheme="minorHAnsi" w:cstheme="minorHAnsi"/>
-        </w:rPr>
-        <w:t xml:space="preserve"> </w:t>
-      </w:r>
-      <w:r>
-        <w:rPr>
-          <w:rFonts w:asciiTheme="minorHAnsi" w:hAnsiTheme="minorHAnsi" w:cstheme="minorHAnsi"/>
-        </w:rPr>
-        <w:t xml:space="preserve">by the moderator </w:t>
-      </w:r>
-      <w:r>
-        <w:rPr>
-          <w:rFonts w:asciiTheme="minorHAnsi" w:hAnsiTheme="minorHAnsi" w:cstheme="minorHAnsi"/>
-        </w:rPr>
-        <w:t>if the joke is wholly inappropriate</w:t>
-      </w:r>
-      <w:r>
-        <w:rPr>
-          <w:rFonts w:asciiTheme="minorHAnsi" w:hAnsiTheme="minorHAnsi" w:cstheme="minorHAnsi"/>
-        </w:rPr>
-        <w:t>, the next one</w:t>
-      </w:r>
-      <w:r>
-        <w:rPr>
-          <w:rFonts w:asciiTheme="minorHAnsi" w:hAnsiTheme="minorHAnsi" w:cstheme="minorHAnsi"/>
-        </w:rPr>
-        <w:t xml:space="preserve"> in the queue</w:t>
-      </w:r>
-      <w:r>
-        <w:rPr>
-          <w:rFonts w:asciiTheme="minorHAnsi" w:hAnsiTheme="minorHAnsi" w:cstheme="minorHAnsi"/>
-        </w:rPr>
-        <w:t>, if available, should be loaded into the UI.</w:t>
-      </w:r>
-      <w:r>
-        <w:rPr>
-          <w:rFonts w:asciiTheme="minorHAnsi" w:hAnsiTheme="minorHAnsi" w:cstheme="minorHAnsi"/>
-        </w:rPr>
-        <w:t xml:space="preserve"> </w:t>
-      </w:r>
-      <w:r>
-        <w:rPr>
-          <w:rFonts w:asciiTheme="minorHAnsi" w:hAnsiTheme="minorHAnsi" w:cstheme="minorHAnsi"/>
-        </w:rPr>
-        <w:t xml:space="preserve">Note: deletion in this case is simply a non-submission and a call </w:t>
-      </w:r>
-      <w:r>
-        <w:rPr>
-          <w:rFonts w:asciiTheme="minorHAnsi" w:hAnsiTheme="minorHAnsi" w:cstheme="minorHAnsi"/>
-        </w:rPr>
-        <w:t xml:space="preserve">is made </w:t>
-      </w:r>
-      <w:r>
-        <w:rPr>
-          <w:rFonts w:asciiTheme="minorHAnsi" w:hAnsiTheme="minorHAnsi" w:cstheme="minorHAnsi"/>
-        </w:rPr>
-        <w:t xml:space="preserve">for the next joke. </w:t>
-      </w:r>
-      <w:r>
-        <w:rPr>
-          <w:rFonts w:asciiTheme="minorHAnsi" w:hAnsiTheme="minorHAnsi" w:cstheme="minorHAnsi"/>
-        </w:rPr>
-        <w:t>Typically,</w:t>
-      </w:r>
-      <w:r>
-        <w:rPr>
-          <w:rFonts w:asciiTheme="minorHAnsi" w:hAnsiTheme="minorHAnsi" w:cstheme="minorHAnsi"/>
-        </w:rPr>
-        <w:t xml:space="preserve"> however, we would generate a deleted event which could be subscribed to by an analytics microservice for example</w:t>
-      </w:r>
-      <w:r>
-        <w:rPr>
-          <w:rFonts w:asciiTheme="minorHAnsi" w:hAnsiTheme="minorHAnsi" w:cstheme="minorHAnsi"/>
-        </w:rPr>
-        <w:t>, but that’s not necessary in this case</w:t>
-      </w:r>
-      <w:r>
-        <w:rPr>
-          <w:rFonts w:asciiTheme="minorHAnsi" w:hAnsiTheme="minorHAnsi" w:cstheme="minorHAnsi"/>
-        </w:rPr>
-        <w:t xml:space="preserve">. </w:t>
-      </w:r>
-    </w:p>
-    <w:p/>
-    <w:p>
-      <w:r>
-        <w:t xml:space="preserve">This </w:t>
-      </w:r>
-      <w:r>
-        <w:t xml:space="preserve">modified architecture </w:t>
-      </w:r>
-      <w:r>
-        <w:t>requires the broker to be available to all microservices</w:t>
-      </w:r>
-      <w:r>
-        <w:t xml:space="preserve"> and be configured to </w:t>
-      </w:r>
-      <w:r>
-        <w:t xml:space="preserve">manage events. </w:t>
-      </w:r>
-      <w:r>
-        <w:t>The broker works in the same way as before</w:t>
-      </w:r>
-      <w:r>
-        <w:t>,</w:t>
-      </w:r>
-      <w:r>
-        <w:t xml:space="preserve"> but the messaging is a little different. </w:t>
-      </w:r>
-    </w:p>
-    <w:p/>
-    <w:p>
-      <w:r>
-        <w:t xml:space="preserve">The </w:t>
-      </w:r>
-      <w:r>
-        <w:t xml:space="preserve">submit </w:t>
-      </w:r>
-      <w:r>
-        <w:t xml:space="preserve">microservice </w:t>
-      </w:r>
-      <w:r>
-        <w:t xml:space="preserve">(producer) </w:t>
-      </w:r>
-      <w:r>
-        <w:t xml:space="preserve">puts the submitted new joke onto a queue </w:t>
-      </w:r>
-      <w:r>
-        <w:t>(submit</w:t>
-      </w:r>
-      <w:r>
-        <w:t xml:space="preserve">) </w:t>
-      </w:r>
-      <w:r>
-        <w:t xml:space="preserve">which is received by the </w:t>
-      </w:r>
-      <w:r>
-        <w:t>moderate service</w:t>
-      </w:r>
-      <w:r>
-        <w:t xml:space="preserve"> (consumer)</w:t>
-      </w:r>
-      <w:r>
-        <w:t xml:space="preserve">. </w:t>
-      </w:r>
-      <w:r>
-        <w:t xml:space="preserve">When the moderator has reviewed the joke and potentially edited it, </w:t>
-      </w:r>
-      <w:r>
-        <w:t xml:space="preserve">it is sent </w:t>
-      </w:r>
-      <w:r>
-        <w:t xml:space="preserve">by the moderate microservice </w:t>
-      </w:r>
-      <w:r>
-        <w:t xml:space="preserve">as a producer </w:t>
-      </w:r>
-      <w:r>
-        <w:t xml:space="preserve">to a queue </w:t>
-      </w:r>
-      <w:r>
-        <w:t>(</w:t>
-      </w:r>
-      <w:r>
-        <w:t>moderated</w:t>
-      </w:r>
-      <w:r>
-        <w:t xml:space="preserve">) </w:t>
-      </w:r>
-      <w:r>
-        <w:t xml:space="preserve">and </w:t>
-      </w:r>
-      <w:r>
-        <w:t xml:space="preserve">received by the joke microservice </w:t>
-      </w:r>
-      <w:r>
-        <w:t>ETL</w:t>
-      </w:r>
-      <w:r>
-        <w:t xml:space="preserve"> application (consumer) </w:t>
-      </w:r>
-      <w:r>
-        <w:t>to be written into the database as shown in the architectural diagram</w:t>
-      </w:r>
-      <w:r>
-        <w:t xml:space="preserve">. </w:t>
-      </w:r>
-      <w:r>
-        <w:t xml:space="preserve">This is only slightly different to the previous option with the addition of an </w:t>
-      </w:r>
-      <w:proofErr w:type="spellStart"/>
-      <w:r>
-        <w:t>additionalqueue</w:t>
-      </w:r>
-      <w:proofErr w:type="spellEnd"/>
-      <w:r>
-        <w:t>.</w:t>
-      </w:r>
-      <w:r>
-        <w:t xml:space="preserve"> </w:t>
-      </w:r>
-    </w:p>
-    <w:p/>
-    <w:p>
-      <w:r>
-        <w:t>Rather than continually call the joke type API to try to keep the types</w:t>
+        <w:t xml:space="preserve"> file cache. This enables the </w:t>
+      </w:r>
+      <w:r>
+        <w:t>types</w:t>
       </w:r>
       <w:r>
         <w:t>’</w:t>
       </w:r>
-      <w:r>
-        <w:t xml:space="preserve"> cache in sync with the master data </w:t>
-      </w:r>
-      <w:r>
-        <w:t>store (</w:t>
-      </w:r>
-      <w:proofErr w:type="spellStart"/>
-      <w:r>
-        <w:t>SoR</w:t>
-      </w:r>
-      <w:proofErr w:type="spellEnd"/>
-      <w:r>
-        <w:t xml:space="preserve">), the </w:t>
-      </w:r>
-      <w:r>
-        <w:t>ETL</w:t>
-      </w:r>
-      <w:r>
-        <w:t xml:space="preserve"> application will </w:t>
-      </w:r>
-      <w:r>
-        <w:t>writ</w:t>
-      </w:r>
-      <w:r>
-        <w:t>e</w:t>
-      </w:r>
-      <w:r>
-        <w:t xml:space="preserve"> the type to the types</w:t>
-      </w:r>
-      <w:r>
-        <w:t>’</w:t>
-      </w:r>
-      <w:r>
-        <w:t xml:space="preserve"> database table </w:t>
-      </w:r>
-      <w:r>
-        <w:t>if it is not already present</w:t>
-      </w:r>
-      <w:r>
-        <w:t xml:space="preserve"> and i</w:t>
-      </w:r>
-      <w:r>
-        <w:t xml:space="preserve">f a write is successful, </w:t>
-      </w:r>
-      <w:r>
-        <w:t>ETL</w:t>
-      </w:r>
-      <w:r>
-        <w:t xml:space="preserve"> will create a </w:t>
-      </w:r>
-      <w:proofErr w:type="spellStart"/>
-      <w:r>
-        <w:t>type_update</w:t>
-      </w:r>
-      <w:proofErr w:type="spellEnd"/>
-      <w:r>
-        <w:t xml:space="preserve"> event and send it to the broker. All subscribers (moderate and submit) will receive the event and update their </w:t>
-      </w:r>
-      <w:proofErr w:type="gramStart"/>
-      <w:r>
-        <w:t>types</w:t>
-      </w:r>
-      <w:r>
-        <w:t>’</w:t>
-      </w:r>
-      <w:proofErr w:type="gramEnd"/>
-      <w:r>
-        <w:t xml:space="preserve"> file cache. This enables the </w:t>
-      </w:r>
-      <w:proofErr w:type="gramStart"/>
-      <w:r>
-        <w:t>types</w:t>
-      </w:r>
-      <w:r>
-        <w:t>’</w:t>
-      </w:r>
-      <w:proofErr w:type="gramEnd"/>
       <w:r>
         <w:t xml:space="preserve"> API call to simply read the file content </w:t>
       </w:r>

</xml_diff>